<commit_message>
feat(despliegue): dockerizar el frontend y aligerar la imagen del backend
Backend: instalar torch en su variante CPU en vez de la build con CUDA (10,2 GB -> 3,67 GB). Frontend: Dockerfile multi-etapa con salida standalone (395 MB) y servicio en ambos compose. Corrige el build de produccion, roto por Turbopack con Tailwind v4.3. Separa BACKEND_INTERNAL_URL para las llamadas servidor-a-servidor de NextAuth. Actualiza README y guia de traspaso.
</commit_message>
<xml_diff>
--- a/docs/Guia_traspaso_tecnico_HUAP.docx
+++ b/docs/Guia_traspaso_tecnico_HUAP.docx
@@ -690,7 +690,7 @@
           <w:sz w:val="21"/>
           <w:szCs w:val="21"/>
         </w:rPr>
-        <w:t xml:space="preserve">Archivos de despliegue: </w:t>
+        <w:t xml:space="preserve">Archivos de despliegue: Dockerfile del backend y del frontend, y los archivos docker-compose de desarrollo y de producción.</w:t>
       </w:r>
       <w:proofErr w:type="spellStart"/>
       <w:r>
@@ -699,7 +699,7 @@
           <w:sz w:val="21"/>
           <w:szCs w:val="21"/>
         </w:rPr>
-        <w:t>Dockerfile</w:t>
+        <w:t xml:space="preserve"/>
       </w:r>
       <w:proofErr w:type="spellEnd"/>
       <w:r>
@@ -708,7 +708,7 @@
           <w:sz w:val="21"/>
           <w:szCs w:val="21"/>
         </w:rPr>
-        <w:t xml:space="preserve"> del </w:t>
+        <w:t xml:space="preserve"/>
       </w:r>
       <w:proofErr w:type="spellStart"/>
       <w:r>
@@ -717,7 +717,7 @@
           <w:sz w:val="21"/>
           <w:szCs w:val="21"/>
         </w:rPr>
-        <w:t>backend</w:t>
+        <w:t xml:space="preserve"/>
       </w:r>
       <w:proofErr w:type="spellEnd"/>
       <w:r>
@@ -726,7 +726,7 @@
           <w:sz w:val="21"/>
           <w:szCs w:val="21"/>
         </w:rPr>
-        <w:t xml:space="preserve"> y </w:t>
+        <w:t xml:space="preserve"/>
       </w:r>
       <w:proofErr w:type="spellStart"/>
       <w:r>
@@ -735,7 +735,7 @@
           <w:sz w:val="21"/>
           <w:szCs w:val="21"/>
         </w:rPr>
-        <w:t>docker-compose.yml</w:t>
+        <w:t xml:space="preserve"/>
       </w:r>
       <w:proofErr w:type="spellEnd"/>
       <w:r>
@@ -744,7 +744,7 @@
           <w:sz w:val="21"/>
           <w:szCs w:val="21"/>
         </w:rPr>
-        <w:t xml:space="preserve"> de referencia.</w:t>
+        <w:t xml:space="preserve"/>
       </w:r>
     </w:p>
     <w:p>
@@ -9021,7 +9021,7 @@
           <w:sz w:val="21"/>
           <w:szCs w:val="21"/>
         </w:rPr>
-        <w:t xml:space="preserve">Node.js 20 o superior para compilar el </w:t>
+        <w:t xml:space="preserve">No se requiere Node.js ni Python instalados en el servidor: el backend y el frontend se ejecutan dentro de contenedores.</w:t>
       </w:r>
       <w:proofErr w:type="spellStart"/>
       <w:r>
@@ -9030,7 +9030,7 @@
           <w:sz w:val="21"/>
           <w:szCs w:val="21"/>
         </w:rPr>
-        <w:t>frontend</w:t>
+        <w:t xml:space="preserve"/>
       </w:r>
       <w:proofErr w:type="spellEnd"/>
       <w:r>
@@ -9039,7 +9039,7 @@
           <w:sz w:val="21"/>
           <w:szCs w:val="21"/>
         </w:rPr>
-        <w:t>.</w:t>
+        <w:t xml:space="preserve"/>
       </w:r>
     </w:p>
     <w:p>
@@ -9093,7 +9093,7 @@
           <w:sz w:val="21"/>
           <w:szCs w:val="21"/>
         </w:rPr>
-        <w:t xml:space="preserve">Aproximadamente 2 GB de espacio en disco: la imagen del </w:t>
+        <w:t xml:space="preserve">Aproximadamente 5 GB de espacio en disco: la imagen del backend incorpora un modelo de embeddings de unos 470 MB descargado durante la construcción, y la del frontend lleva la aplicación ya compilada.</w:t>
       </w:r>
       <w:proofErr w:type="spellStart"/>
       <w:r>
@@ -9102,7 +9102,7 @@
           <w:sz w:val="21"/>
           <w:szCs w:val="21"/>
         </w:rPr>
-        <w:t>backend</w:t>
+        <w:t xml:space="preserve"/>
       </w:r>
       <w:proofErr w:type="spellEnd"/>
       <w:r>
@@ -9111,7 +9111,7 @@
           <w:sz w:val="21"/>
           <w:szCs w:val="21"/>
         </w:rPr>
-        <w:t xml:space="preserve"> incorpora un modelo de </w:t>
+        <w:t xml:space="preserve"/>
       </w:r>
       <w:proofErr w:type="spellStart"/>
       <w:r>
@@ -9120,7 +9120,7 @@
           <w:sz w:val="21"/>
           <w:szCs w:val="21"/>
         </w:rPr>
-        <w:t>embeddings</w:t>
+        <w:t xml:space="preserve"/>
       </w:r>
       <w:proofErr w:type="spellEnd"/>
       <w:r>
@@ -9129,7 +9129,7 @@
           <w:sz w:val="21"/>
           <w:szCs w:val="21"/>
         </w:rPr>
-        <w:t xml:space="preserve"> de unos 470 MB descargado durante la construcción.</w:t>
+        <w:t xml:space="preserve"/>
       </w:r>
     </w:p>
     <w:p>
@@ -9841,7 +9841,7 @@
           <w:szCs w:val="19"/>
           <w:shd w:val="clear" w:color="auto" w:fill="F2F2F2"/>
         </w:rPr>
-        <w:t>frontend</w:t>
+        <w:t xml:space="preserve">frontend/.env</w:t>
       </w:r>
       <w:proofErr w:type="spellEnd"/>
       <w:proofErr w:type="gramStart"/>
@@ -9852,7 +9852,7 @@
           <w:szCs w:val="19"/>
           <w:shd w:val="clear" w:color="auto" w:fill="F2F2F2"/>
         </w:rPr>
-        <w:t>/.</w:t>
+        <w:t xml:space="preserve"/>
       </w:r>
       <w:proofErr w:type="spellStart"/>
       <w:r>
@@ -9862,7 +9862,7 @@
           <w:szCs w:val="19"/>
           <w:shd w:val="clear" w:color="auto" w:fill="F2F2F2"/>
         </w:rPr>
-        <w:t>env</w:t>
+        <w:t xml:space="preserve"/>
       </w:r>
       <w:proofErr w:type="gramEnd"/>
       <w:r>
@@ -9872,7 +9872,7 @@
           <w:szCs w:val="19"/>
           <w:shd w:val="clear" w:color="auto" w:fill="F2F2F2"/>
         </w:rPr>
-        <w:t>.local</w:t>
+        <w:t xml:space="preserve"/>
       </w:r>
       <w:proofErr w:type="spellEnd"/>
       <w:r>
@@ -9881,7 +9881,7 @@
           <w:sz w:val="21"/>
           <w:szCs w:val="21"/>
         </w:rPr>
-        <w:t>:</w:t>
+        <w:t xml:space="preserve"> (valores de tiempo de ejecución):</w:t>
       </w:r>
     </w:p>
     <w:tbl>
@@ -9938,17 +9938,17 @@
                 <w:sz w:val="18"/>
                 <w:szCs w:val="18"/>
               </w:rPr>
-              <w:t># Subdominio del BACKEND, incluyendo el sufijo /api</w:t>
-            </w:r>
-          </w:p>
-          <w:p>
-            <w:r>
-              <w:rPr>
-                <w:rFonts w:ascii="Consolas" w:eastAsia="Consolas" w:hAnsi="Consolas" w:cs="Consolas"/>
-                <w:sz w:val="18"/>
-                <w:szCs w:val="18"/>
-              </w:rPr>
-              <w:t>NEXT_PUBLIC_API_URL=https://api.guiadigital.ejemplo.cl/api</w:t>
+              <w:t xml:space="preserve"># NEXT_PUBLIC_API_URL ya no se define aqui: se incrusta durante</w:t>
+            </w:r>
+          </w:p>
+          <w:p>
+            <w:r>
+              <w:rPr>
+                <w:rFonts w:ascii="Consolas" w:eastAsia="Consolas" w:hAnsi="Consolas" w:cs="Consolas"/>
+                <w:sz w:val="18"/>
+                <w:szCs w:val="18"/>
+              </w:rPr>
+              <w:t xml:space="preserve"># el build. Va en el .env de la raiz del repo (ver 7.4).</w:t>
             </w:r>
           </w:p>
           <w:p/>
@@ -10064,7 +10064,7 @@
           <w:sz w:val="21"/>
           <w:szCs w:val="21"/>
         </w:rPr>
-        <w:t>backend</w:t>
+        <w:t xml:space="preserve">backend</w:t>
       </w:r>
       <w:proofErr w:type="spellEnd"/>
       <w:r>
@@ -10082,7 +10082,7 @@
           <w:sz w:val="21"/>
           <w:szCs w:val="21"/>
         </w:rPr>
-        <w:t>frontend</w:t>
+        <w:t xml:space="preserve">frontend</w:t>
       </w:r>
       <w:proofErr w:type="spellEnd"/>
       <w:r>
@@ -10100,7 +10100,7 @@
           <w:sz w:val="21"/>
           <w:szCs w:val="21"/>
         </w:rPr>
-        <w:t>frontend</w:t>
+        <w:t xml:space="preserve">frontend</w:t>
       </w:r>
       <w:proofErr w:type="spellEnd"/>
       <w:r>
@@ -10118,7 +10118,7 @@
           <w:sz w:val="21"/>
           <w:szCs w:val="21"/>
         </w:rPr>
-        <w:t>backend</w:t>
+        <w:t xml:space="preserve">backend</w:t>
       </w:r>
       <w:proofErr w:type="spellEnd"/>
       <w:r>
@@ -10127,7 +10127,7 @@
           <w:sz w:val="21"/>
           <w:szCs w:val="21"/>
         </w:rPr>
-        <w:t>. Un desajuste entre ellos produce errores de CORS o de redirección tras el inicio de sesión.</w:t>
+        <w:t xml:space="preserve">. Un desajuste entre ellos produce errores de CORS o de redirección tras el inicio de sesión. A diferencia de las demás, NEXT_PUBLIC_API_URL no se lee al arrancar el contenedor: queda incrustada en la aplicación durante la construcción de la imagen, por lo que cambiarla obliga a reconstruir el frontend.</w:t>
       </w:r>
     </w:p>
     <w:p>
@@ -10168,7 +10168,7 @@
           <w:sz w:val="21"/>
           <w:szCs w:val="21"/>
         </w:rPr>
-        <w:t>Compose</w:t>
+        <w:t xml:space="preserve">Compose</w:t>
       </w:r>
       <w:proofErr w:type="spellEnd"/>
       <w:r>
@@ -10187,7 +10187,7 @@
           <w:szCs w:val="19"/>
           <w:shd w:val="clear" w:color="auto" w:fill="F2F2F2"/>
         </w:rPr>
-        <w:t>docker-compose.prod.yml</w:t>
+        <w:t xml:space="preserve">docker-compose.prod.yml</w:t>
       </w:r>
       <w:proofErr w:type="spellEnd"/>
       <w:r>
@@ -10206,7 +10206,7 @@
           <w:szCs w:val="19"/>
           <w:shd w:val="clear" w:color="auto" w:fill="F2F2F2"/>
         </w:rPr>
-        <w:t>docker-compose.yml</w:t>
+        <w:t xml:space="preserve">docker-compose.yml</w:t>
       </w:r>
       <w:proofErr w:type="spellEnd"/>
       <w:r>
@@ -10215,7 +10215,7 @@
           <w:sz w:val="21"/>
           <w:szCs w:val="21"/>
         </w:rPr>
-        <w:t>, que es solo para desarrollo local.</w:t>
+        <w:t xml:space="preserve">, que es solo para desarrollo local. El archivo de producción levanta los tres componentes del sistema —base de datos, backend y frontend— en contenedores, y define por si mismo la variable BACKEND_INTERNAL_URL para que el servidor de Next.js hable con el backend por la red interna de Docker: no requiere configuracion manual.</w:t>
       </w:r>
     </w:p>
     <w:p>
@@ -10278,7 +10278,7 @@
                 <w:szCs w:val="18"/>
               </w:rPr>
               <w:lastRenderedPageBreak/>
-              <w:t xml:space="preserve"># 1. Credenciales de la base de datos, en un </w:t>
+              <w:t xml:space="preserve"># 1. Variables de despliegue, en un archivo .env en la raiz del repo</w:t>
             </w:r>
             <w:proofErr w:type="gramStart"/>
             <w:r>
@@ -10287,7 +10287,7 @@
                 <w:sz w:val="18"/>
                 <w:szCs w:val="18"/>
               </w:rPr>
-              <w:t>archivo .</w:t>
+              <w:t xml:space="preserve"/>
             </w:r>
             <w:proofErr w:type="spellStart"/>
             <w:r>
@@ -10296,7 +10296,7 @@
                 <w:sz w:val="18"/>
                 <w:szCs w:val="18"/>
               </w:rPr>
-              <w:t>env</w:t>
+              <w:t xml:space="preserve"/>
             </w:r>
             <w:proofErr w:type="spellEnd"/>
             <w:proofErr w:type="gramEnd"/>
@@ -10306,7 +10306,7 @@
                 <w:sz w:val="18"/>
                 <w:szCs w:val="18"/>
               </w:rPr>
-              <w:t xml:space="preserve"> en la </w:t>
+              <w:t xml:space="preserve"/>
             </w:r>
             <w:proofErr w:type="spellStart"/>
             <w:r>
@@ -10315,7 +10315,7 @@
                 <w:sz w:val="18"/>
                 <w:szCs w:val="18"/>
               </w:rPr>
-              <w:t>raiz</w:t>
+              <w:t xml:space="preserve"/>
             </w:r>
             <w:proofErr w:type="spellEnd"/>
             <w:r>
@@ -10324,7 +10324,7 @@
                 <w:sz w:val="18"/>
                 <w:szCs w:val="18"/>
               </w:rPr>
-              <w:t xml:space="preserve"> del repo</w:t>
+              <w:t xml:space="preserve"/>
             </w:r>
           </w:p>
           <w:p>
@@ -10340,7 +10340,7 @@
                 <w:szCs w:val="18"/>
                 <w:lang w:val="en-US"/>
               </w:rPr>
-              <w:t xml:space="preserve"># </w:t>
+              <w:t xml:space="preserve">#    (ver .env.example): POSTGRES_*, y NEXT_PUBLIC_API_URL del frontend</w:t>
             </w:r>
             <w:proofErr w:type="gramStart"/>
             <w:r>
@@ -10350,7 +10350,7 @@
                 <w:szCs w:val="18"/>
                 <w:lang w:val="en-US"/>
               </w:rPr>
-              <w:t xml:space="preserve">   (</w:t>
+              <w:t xml:space="preserve"/>
             </w:r>
             <w:proofErr w:type="spellStart"/>
             <w:r>
@@ -10360,7 +10360,7 @@
                 <w:szCs w:val="18"/>
                 <w:lang w:val="en-US"/>
               </w:rPr>
-              <w:t>ver</w:t>
+              <w:t xml:space="preserve"/>
             </w:r>
             <w:proofErr w:type="spellEnd"/>
             <w:r>
@@ -10370,7 +10370,7 @@
                 <w:szCs w:val="18"/>
                 <w:lang w:val="en-US"/>
               </w:rPr>
-              <w:t xml:space="preserve"> .</w:t>
+              <w:t xml:space="preserve"/>
             </w:r>
             <w:proofErr w:type="spellStart"/>
             <w:r>
@@ -10380,7 +10380,7 @@
                 <w:szCs w:val="18"/>
                 <w:lang w:val="en-US"/>
               </w:rPr>
-              <w:t>env</w:t>
+              <w:t xml:space="preserve"/>
             </w:r>
             <w:proofErr w:type="gramEnd"/>
             <w:r>
@@ -10390,7 +10390,7 @@
                 <w:szCs w:val="18"/>
                 <w:lang w:val="en-US"/>
               </w:rPr>
-              <w:t>.example</w:t>
+              <w:t xml:space="preserve"/>
             </w:r>
             <w:proofErr w:type="spellEnd"/>
             <w:r>
@@ -10400,7 +10400,7 @@
                 <w:szCs w:val="18"/>
                 <w:lang w:val="en-US"/>
               </w:rPr>
-              <w:t>): POSTGRES_USER, POSTGRES_PASSWORD, POSTGRES_DB</w:t>
+              <w:t xml:space="preserve"/>
             </w:r>
           </w:p>
           <w:p>
@@ -10423,7 +10423,7 @@
                 <w:szCs w:val="18"/>
                 <w:lang w:val="en-US"/>
               </w:rPr>
-              <w:t xml:space="preserve"># 2. Backend + base de </w:t>
+              <w:t xml:space="preserve"># 2. Base de datos, backend y frontend</w:t>
             </w:r>
             <w:proofErr w:type="spellStart"/>
             <w:r>
@@ -10433,7 +10433,7 @@
                 <w:szCs w:val="18"/>
                 <w:lang w:val="en-US"/>
               </w:rPr>
-              <w:t>datos</w:t>
+              <w:t xml:space="preserve"/>
             </w:r>
             <w:proofErr w:type="spellEnd"/>
           </w:p>
@@ -10628,7 +10628,7 @@
                 <w:szCs w:val="18"/>
                 <w:lang w:val="en-US"/>
               </w:rPr>
-              <w:t># 4. Frontend</w:t>
+              <w:t xml:space="preserve"># 4. Verificar que los tres servicios quedaron en ejecucion</w:t>
             </w:r>
           </w:p>
           <w:p>
@@ -10644,7 +10644,7 @@
                 <w:szCs w:val="18"/>
                 <w:lang w:val="en-US"/>
               </w:rPr>
-              <w:t>cd frontend</w:t>
+              <w:t xml:space="preserve">docker compose -f docker-compose.prod.yml ps</w:t>
             </w:r>
           </w:p>
           <w:p>
@@ -10661,7 +10661,7 @@
                 <w:szCs w:val="18"/>
                 <w:lang w:val="en-US"/>
               </w:rPr>
-              <w:t>npm</w:t>
+              <w:t xml:space="preserve"/>
             </w:r>
             <w:proofErr w:type="spellEnd"/>
             <w:r>
@@ -10671,7 +10671,7 @@
                 <w:szCs w:val="18"/>
                 <w:lang w:val="en-US"/>
               </w:rPr>
-              <w:t xml:space="preserve"> ci</w:t>
+              <w:t xml:space="preserve"/>
             </w:r>
           </w:p>
           <w:p>
@@ -10688,7 +10688,7 @@
                 <w:szCs w:val="18"/>
                 <w:lang w:val="en-US"/>
               </w:rPr>
-              <w:t>npm</w:t>
+              <w:t xml:space="preserve"># El frontend escucha en 127.0.0.1:3000 y el backend en 127.0.0.1:8000;</w:t>
             </w:r>
             <w:proofErr w:type="spellEnd"/>
             <w:r>
@@ -10698,7 +10698,7 @@
                 <w:szCs w:val="18"/>
                 <w:lang w:val="en-US"/>
               </w:rPr>
-              <w:t xml:space="preserve"> run build</w:t>
+              <w:t xml:space="preserve"/>
             </w:r>
           </w:p>
           <w:p>
@@ -10709,7 +10709,7 @@
                 <w:sz w:val="18"/>
                 <w:szCs w:val="18"/>
               </w:rPr>
-              <w:t>npm</w:t>
+              <w:t xml:space="preserve"># nginx es quien los expone hacia afuera (seccion 7.5).</w:t>
             </w:r>
             <w:proofErr w:type="spellEnd"/>
             <w:r>
@@ -10718,7 +10718,7 @@
                 <w:sz w:val="18"/>
                 <w:szCs w:val="18"/>
               </w:rPr>
-              <w:t xml:space="preserve"> run </w:t>
+              <w:t xml:space="preserve"/>
             </w:r>
             <w:proofErr w:type="spellStart"/>
             <w:r>
@@ -10727,7 +10727,7 @@
                 <w:sz w:val="18"/>
                 <w:szCs w:val="18"/>
               </w:rPr>
-              <w:t>start</w:t>
+              <w:t xml:space="preserve"/>
             </w:r>
             <w:proofErr w:type="spellEnd"/>
           </w:p>
@@ -17657,7 +17657,7 @@
                 <w:sz w:val="19"/>
                 <w:szCs w:val="19"/>
               </w:rPr>
-              <w:t xml:space="preserve">URL del </w:t>
+              <w:t xml:space="preserve">URL del backend con el sufijo /api. Se define en el .env de la raíz del repositorio y se incrusta durante la construcción de la imagen</w:t>
             </w:r>
             <w:proofErr w:type="spellStart"/>
             <w:r>
@@ -17666,7 +17666,7 @@
                 <w:sz w:val="19"/>
                 <w:szCs w:val="19"/>
               </w:rPr>
-              <w:t>backend</w:t>
+              <w:t xml:space="preserve"/>
             </w:r>
             <w:proofErr w:type="spellEnd"/>
             <w:r>
@@ -17675,7 +17675,7 @@
                 <w:sz w:val="19"/>
                 <w:szCs w:val="19"/>
               </w:rPr>
-              <w:t>, incluyendo el sufijo /api</w:t>
+              <w:t xml:space="preserve"/>
             </w:r>
           </w:p>
         </w:tc>

</xml_diff>